<commit_message>
Handle cross-run Chinese-English spacing
</commit_message>
<xml_diff>
--- a/examples/after/sample.docx
+++ b/examples/after/sample.docx
@@ -15,6 +15,36 @@
               <w:t>河蚬As暴露</w:t>
             </w:r>
           </w:p>
+          <w:p>
+            <w:r>
+              <w:rPr>
+                <w:rFonts w:eastAsia="宋体" w:ascii="Times New Roman" w:hAnsi="Times New Roman" w:cs="Times New Roman"/>
+                <w:color w:val="000000"/>
+              </w:rPr>
+              <w:t>贝类</w:t>
+            </w:r>
+            <w:r>
+              <w:rPr>
+                <w:rFonts w:eastAsia="宋体" w:ascii="Times New Roman" w:hAnsi="Times New Roman" w:cs="Times New Roman"/>
+                <w:color w:val="000000"/>
+              </w:rPr>
+              <w:t/>
+            </w:r>
+            <w:r>
+              <w:rPr>
+                <w:rFonts w:eastAsia="宋体" w:ascii="Times New Roman" w:hAnsi="Times New Roman" w:cs="Times New Roman"/>
+                <w:color w:val="000000"/>
+              </w:rPr>
+              <w:t>As</w:t>
+            </w:r>
+            <w:r>
+              <w:rPr>
+                <w:rFonts w:eastAsia="宋体" w:ascii="Times New Roman" w:hAnsi="Times New Roman" w:cs="Times New Roman"/>
+                <w:color w:val="000000"/>
+              </w:rPr>
+              <w:t>暴露</w:t>
+            </w:r>
+          </w:p>
         </w:tc>
       </w:tr>
     </w:tbl>

</xml_diff>